<commit_message>
Day 14: deepen Materi to the plan's Wissen (rule 2.17) with real findings
All 13 Wissen topics are now full: the reality-virtuality continuum, presence, the cybersickness
range, the training meta-analysis, the GOV.UK phases and Service Standard, identifiability of VR
tracking data and Apple's immersion guidance. Day 14 added to verify:depth; Word documents of
Day 14 rebuilt.

Co-Authored-By: Claude Sonnet 5.5 <noreply@anthropic.com>
</commit_message>
<xml_diff>
--- a/docx/Day14-Materi-AION-UX-Developer-Immersive-technologies-and-neuroscientific-UX-basics.docx
+++ b/docx/Day14-Materi-AION-UX-Developer-Immersive-technologies-and-neuroscientific-UX-basics.docx
@@ -2998,6 +2998,266 @@
         <w:spacing w:before="0" w:after="80"/>
       </w:pPr>
     </w:p>
+    <w:p>
+      <w:pPr>
+        <w:spacing w:before="0" w:after="100"/>
+      </w:pPr>
+      <w:r>
+        <w:rPr>
+          <w:b/>
+        </w:rPr>
+        <w:t>From screen to space: the concepts and where they come from</w:t>
+      </w:r>
+    </w:p>
+    <w:tbl>
+      <w:tblPr>
+        <w:tblW w:w="9638" w:type="dxa"/>
+        <w:tblBorders>
+          <w:top w:val="single" w:sz="4" w:space="0" w:color="D5DEE9"/>
+          <w:left w:val="single" w:sz="4" w:space="0" w:color="D5DEE9"/>
+          <w:bottom w:val="single" w:sz="4" w:space="0" w:color="D5DEE9"/>
+          <w:right w:val="single" w:sz="4" w:space="0" w:color="D5DEE9"/>
+          <w:insideH w:val="single" w:sz="4" w:space="0" w:color="D5DEE9"/>
+          <w:insideV w:val="single" w:sz="4" w:space="0" w:color="D5DEE9"/>
+        </w:tblBorders>
+        <w:tblLayout w:type="fixed"/>
+        <w:tblCellMar>
+          <w:top w:w="60" w:type="dxa"/>
+          <w:left w:w="100" w:type="dxa"/>
+          <w:bottom w:w="60" w:type="dxa"/>
+          <w:right w:w="100" w:type="dxa"/>
+        </w:tblCellMar>
+      </w:tblPr>
+      <w:tblGrid>
+        <w:gridCol w:w="1484"/>
+        <w:gridCol w:w="5568"/>
+        <w:gridCol w:w="2586"/>
+      </w:tblGrid>
+      <w:tr>
+        <w:trPr>
+          <w:cantSplit/>
+          <w:tblHeader/>
+        </w:trPr>
+        <w:tc>
+          <w:tcPr>
+            <w:tcW w:type="dxa" w:w="1484"/>
+            <w:shd w:val="clear" w:color="auto" w:fill="E6ECF4"/>
+          </w:tcPr>
+          <w:p>
+            <w:pPr>
+              <w:spacing w:before="0" w:after="0"/>
+            </w:pPr>
+            <w:r>
+              <w:rPr>
+                <w:b/>
+                <w:sz w:val="20"/>
+              </w:rPr>
+              <w:t>Concept</w:t>
+            </w:r>
+          </w:p>
+        </w:tc>
+        <w:tc>
+          <w:tcPr>
+            <w:tcW w:type="dxa" w:w="5568"/>
+            <w:shd w:val="clear" w:color="auto" w:fill="E6ECF4"/>
+          </w:tcPr>
+          <w:p>
+            <w:pPr>
+              <w:spacing w:before="0" w:after="0"/>
+            </w:pPr>
+            <w:r>
+              <w:rPr>
+                <w:b/>
+                <w:sz w:val="20"/>
+              </w:rPr>
+              <w:t>Real source</w:t>
+            </w:r>
+          </w:p>
+        </w:tc>
+        <w:tc>
+          <w:tcPr>
+            <w:tcW w:type="dxa" w:w="2586"/>
+            <w:shd w:val="clear" w:color="auto" w:fill="E6ECF4"/>
+          </w:tcPr>
+          <w:p>
+            <w:pPr>
+              <w:spacing w:before="0" w:after="0"/>
+            </w:pPr>
+            <w:r>
+              <w:rPr>
+                <w:b/>
+                <w:sz w:val="20"/>
+              </w:rPr>
+              <w:t>What it means for a decision</w:t>
+            </w:r>
+          </w:p>
+        </w:tc>
+      </w:tr>
+      <w:tr>
+        <w:trPr>
+          <w:cantSplit/>
+        </w:trPr>
+        <w:tc>
+          <w:tcPr>
+            <w:tcW w:type="dxa" w:w="1484"/>
+          </w:tcPr>
+          <w:p>
+            <w:pPr>
+              <w:spacing w:before="0" w:after="0"/>
+            </w:pPr>
+            <w:r>
+              <w:rPr>
+                <w:sz w:val="20"/>
+              </w:rPr>
+              <w:t>The continuum</w:t>
+            </w:r>
+          </w:p>
+        </w:tc>
+        <w:tc>
+          <w:tcPr>
+            <w:tcW w:type="dxa" w:w="5568"/>
+          </w:tcPr>
+          <w:p>
+            <w:pPr>
+              <w:spacing w:before="0" w:after="0"/>
+            </w:pPr>
+            <w:r>
+              <w:rPr>
+                <w:sz w:val="20"/>
+              </w:rPr>
+              <w:t>Milgram and Kishino placed displays on a reality–virtuality continuum, from the real world through augmented and mixed reality to a fully virtual one (Milgram and Kishino 1994).</w:t>
+            </w:r>
+          </w:p>
+        </w:tc>
+        <w:tc>
+          <w:tcPr>
+            <w:tcW w:type="dxa" w:w="2586"/>
+          </w:tcPr>
+          <w:p>
+            <w:pPr>
+              <w:spacing w:before="0" w:after="0"/>
+            </w:pPr>
+            <w:r>
+              <w:rPr>
+                <w:sz w:val="20"/>
+              </w:rPr>
+              <w:t>Say where on the continuum a product sits: it decides what it can show, what it needs and what it risks.</w:t>
+            </w:r>
+          </w:p>
+        </w:tc>
+      </w:tr>
+      <w:tr>
+        <w:trPr>
+          <w:cantSplit/>
+        </w:trPr>
+        <w:tc>
+          <w:tcPr>
+            <w:tcW w:type="dxa" w:w="1484"/>
+          </w:tcPr>
+          <w:p>
+            <w:pPr>
+              <w:spacing w:before="0" w:after="0"/>
+            </w:pPr>
+            <w:r>
+              <w:rPr>
+                <w:sz w:val="20"/>
+              </w:rPr>
+              <w:t>Presence</w:t>
+            </w:r>
+          </w:p>
+        </w:tc>
+        <w:tc>
+          <w:tcPr>
+            <w:tcW w:type="dxa" w:w="5568"/>
+          </w:tcPr>
+          <w:p>
+            <w:pPr>
+              <w:spacing w:before="0" w:after="0"/>
+            </w:pPr>
+            <w:r>
+              <w:rPr>
+                <w:sz w:val="20"/>
+              </w:rPr>
+              <w:t>Slater and Sanchez-Vives describe presence as the feeling of being in the virtual place, built from immersion and the plausibility of what happens there (Slater and Sanchez-Vives 2016).</w:t>
+            </w:r>
+          </w:p>
+        </w:tc>
+        <w:tc>
+          <w:tcPr>
+            <w:tcW w:type="dxa" w:w="2586"/>
+          </w:tcPr>
+          <w:p>
+            <w:pPr>
+              <w:spacing w:before="0" w:after="0"/>
+            </w:pPr>
+            <w:r>
+              <w:rPr>
+                <w:sz w:val="20"/>
+              </w:rPr>
+              <w:t>Immersion is a means: ask what presence adds to the task.</w:t>
+            </w:r>
+          </w:p>
+        </w:tc>
+      </w:tr>
+      <w:tr>
+        <w:trPr>
+          <w:cantSplit/>
+        </w:trPr>
+        <w:tc>
+          <w:tcPr>
+            <w:tcW w:type="dxa" w:w="1484"/>
+          </w:tcPr>
+          <w:p>
+            <w:pPr>
+              <w:spacing w:before="0" w:after="0"/>
+            </w:pPr>
+            <w:r>
+              <w:rPr>
+                <w:sz w:val="20"/>
+              </w:rPr>
+              <w:t>Immersion for a reason</w:t>
+            </w:r>
+          </w:p>
+        </w:tc>
+        <w:tc>
+          <w:tcPr>
+            <w:tcW w:type="dxa" w:w="5568"/>
+          </w:tcPr>
+          <w:p>
+            <w:pPr>
+              <w:spacing w:before="0" w:after="0"/>
+            </w:pPr>
+            <w:r>
+              <w:rPr>
+                <w:sz w:val="20"/>
+              </w:rPr>
+              <w:t>Apple's guidelines advise to reserve immersion for meaningful moments, to attend to comfort, and to let people choose when to enter and leave (Apple, Immersive experiences).</w:t>
+            </w:r>
+          </w:p>
+        </w:tc>
+        <w:tc>
+          <w:tcPr>
+            <w:tcW w:type="dxa" w:w="2586"/>
+          </w:tcPr>
+          <w:p>
+            <w:pPr>
+              <w:spacing w:before="0" w:after="0"/>
+            </w:pPr>
+            <w:r>
+              <w:rPr>
+                <w:sz w:val="20"/>
+              </w:rPr>
+              <w:t>Offer the immersive mode as a choice, with an easy exit.</w:t>
+            </w:r>
+          </w:p>
+        </w:tc>
+      </w:tr>
+    </w:tbl>
+    <w:p>
+      <w:pPr>
+        <w:spacing w:before="0" w:after="80"/>
+      </w:pPr>
+    </w:p>
     <w:tbl>
       <w:tblPr>
         <w:tblW w:w="9598" w:type="dxa"/>
@@ -3047,7 +3307,7 @@
             </w:pPr>
             <w:r>
               <w:rPr/>
-              <w:t>Brewline, Zara, Edgar, Kim and Ruth are made up for this example; the 3D machine is a generic model. The continuum from the real world through AR to VR follows Milgram and Kishino (1994).</w:t>
+              <w:t>Brewline, Zara, Edgar, Kim and Ruth are made up for this example; the 3D machine is a generic model. The continuum from the real world through AR to VR follows Milgram and Kishino (1994). The findings in the table of real evidence are real research results, rules and cases; the sources are listed below.</w:t>
             </w:r>
           </w:p>
         </w:tc>
@@ -3236,7 +3496,7 @@
           <w:color w:val="556274"/>
           <w:sz w:val="18"/>
         </w:rPr>
-        <w:t>Milgram &amp; Kishino 1994 · Slater &amp; Sanchez-Vives 2016</w:t>
+        <w:t>Milgram &amp; Kishino 1994 · Slater &amp; Sanchez-Vives 2016 · Apple HIG</w:t>
       </w:r>
     </w:p>
     <w:p>
@@ -3782,6 +4042,266 @@
         <w:spacing w:before="0" w:after="80"/>
       </w:pPr>
     </w:p>
+    <w:p>
+      <w:pPr>
+        <w:spacing w:before="0" w:after="100"/>
+      </w:pPr>
+      <w:r>
+        <w:rPr>
+          <w:b/>
+        </w:rPr>
+        <w:t>Presence, attention and load: findings</w:t>
+      </w:r>
+    </w:p>
+    <w:tbl>
+      <w:tblPr>
+        <w:tblW w:w="9638" w:type="dxa"/>
+        <w:tblBorders>
+          <w:top w:val="single" w:sz="4" w:space="0" w:color="D5DEE9"/>
+          <w:left w:val="single" w:sz="4" w:space="0" w:color="D5DEE9"/>
+          <w:bottom w:val="single" w:sz="4" w:space="0" w:color="D5DEE9"/>
+          <w:right w:val="single" w:sz="4" w:space="0" w:color="D5DEE9"/>
+          <w:insideH w:val="single" w:sz="4" w:space="0" w:color="D5DEE9"/>
+          <w:insideV w:val="single" w:sz="4" w:space="0" w:color="D5DEE9"/>
+        </w:tblBorders>
+        <w:tblLayout w:type="fixed"/>
+        <w:tblCellMar>
+          <w:top w:w="60" w:type="dxa"/>
+          <w:left w:w="100" w:type="dxa"/>
+          <w:bottom w:w="60" w:type="dxa"/>
+          <w:right w:w="100" w:type="dxa"/>
+        </w:tblCellMar>
+      </w:tblPr>
+      <w:tblGrid>
+        <w:gridCol w:w="1935"/>
+        <w:gridCol w:w="4811"/>
+        <w:gridCol w:w="2892"/>
+      </w:tblGrid>
+      <w:tr>
+        <w:trPr>
+          <w:cantSplit/>
+          <w:tblHeader/>
+        </w:trPr>
+        <w:tc>
+          <w:tcPr>
+            <w:tcW w:type="dxa" w:w="1935"/>
+            <w:shd w:val="clear" w:color="auto" w:fill="E6ECF4"/>
+          </w:tcPr>
+          <w:p>
+            <w:pPr>
+              <w:spacing w:before="0" w:after="0"/>
+            </w:pPr>
+            <w:r>
+              <w:rPr>
+                <w:b/>
+                <w:sz w:val="20"/>
+              </w:rPr>
+              <w:t>Finding</w:t>
+            </w:r>
+          </w:p>
+        </w:tc>
+        <w:tc>
+          <w:tcPr>
+            <w:tcW w:type="dxa" w:w="4811"/>
+            <w:shd w:val="clear" w:color="auto" w:fill="E6ECF4"/>
+          </w:tcPr>
+          <w:p>
+            <w:pPr>
+              <w:spacing w:before="0" w:after="0"/>
+            </w:pPr>
+            <w:r>
+              <w:rPr>
+                <w:b/>
+                <w:sz w:val="20"/>
+              </w:rPr>
+              <w:t>What it shows</w:t>
+            </w:r>
+          </w:p>
+        </w:tc>
+        <w:tc>
+          <w:tcPr>
+            <w:tcW w:type="dxa" w:w="2892"/>
+            <w:shd w:val="clear" w:color="auto" w:fill="E6ECF4"/>
+          </w:tcPr>
+          <w:p>
+            <w:pPr>
+              <w:spacing w:before="0" w:after="0"/>
+            </w:pPr>
+            <w:r>
+              <w:rPr>
+                <w:b/>
+                <w:sz w:val="20"/>
+              </w:rPr>
+              <w:t>What it means for a screen in space</w:t>
+            </w:r>
+          </w:p>
+        </w:tc>
+      </w:tr>
+      <w:tr>
+        <w:trPr>
+          <w:cantSplit/>
+        </w:trPr>
+        <w:tc>
+          <w:tcPr>
+            <w:tcW w:type="dxa" w:w="1935"/>
+          </w:tcPr>
+          <w:p>
+            <w:pPr>
+              <w:spacing w:before="0" w:after="0"/>
+            </w:pPr>
+            <w:r>
+              <w:rPr>
+                <w:sz w:val="20"/>
+              </w:rPr>
+              <w:t>Perceptual load</w:t>
+            </w:r>
+          </w:p>
+        </w:tc>
+        <w:tc>
+          <w:tcPr>
+            <w:tcW w:type="dxa" w:w="4811"/>
+          </w:tcPr>
+          <w:p>
+            <w:pPr>
+              <w:spacing w:before="0" w:after="0"/>
+            </w:pPr>
+            <w:r>
+              <w:rPr>
+                <w:sz w:val="20"/>
+              </w:rPr>
+              <w:t>Attention is limited, and under load what is processed depends on what competes for it (Lavie 2005).</w:t>
+            </w:r>
+          </w:p>
+        </w:tc>
+        <w:tc>
+          <w:tcPr>
+            <w:tcW w:type="dxa" w:w="2892"/>
+          </w:tcPr>
+          <w:p>
+            <w:pPr>
+              <w:spacing w:before="0" w:after="0"/>
+            </w:pPr>
+            <w:r>
+              <w:rPr>
+                <w:sz w:val="20"/>
+              </w:rPr>
+              <w:t>One focus per step: every extra object in space competes with the task.</w:t>
+            </w:r>
+          </w:p>
+        </w:tc>
+      </w:tr>
+      <w:tr>
+        <w:trPr>
+          <w:cantSplit/>
+        </w:trPr>
+        <w:tc>
+          <w:tcPr>
+            <w:tcW w:type="dxa" w:w="1935"/>
+          </w:tcPr>
+          <w:p>
+            <w:pPr>
+              <w:spacing w:before="0" w:after="0"/>
+            </w:pPr>
+            <w:r>
+              <w:rPr>
+                <w:sz w:val="20"/>
+              </w:rPr>
+              <w:t>Cybersickness</w:t>
+            </w:r>
+          </w:p>
+        </w:tc>
+        <w:tc>
+          <w:tcPr>
+            <w:tcW w:type="dxa" w:w="4811"/>
+          </w:tcPr>
+          <w:p>
+            <w:pPr>
+              <w:spacing w:before="0" w:after="0"/>
+            </w:pPr>
+            <w:r>
+              <w:rPr>
+                <w:sz w:val="20"/>
+              </w:rPr>
+              <w:t>Papers that cite the main review report that between about 30% and 80% of users get symptoms in virtual environments, and the estimates vary widely with hardware, people and measures (Rebenitsch and Owen 2016, as reported).</w:t>
+            </w:r>
+          </w:p>
+        </w:tc>
+        <w:tc>
+          <w:tcPr>
+            <w:tcW w:type="dxa" w:w="2892"/>
+          </w:tcPr>
+          <w:p>
+            <w:pPr>
+              <w:spacing w:before="0" w:after="0"/>
+            </w:pPr>
+            <w:r>
+              <w:rPr>
+                <w:sz w:val="20"/>
+              </w:rPr>
+              <w:t>Plan for sickness as a normal case: short sessions, stable views, a comfort option.</w:t>
+            </w:r>
+          </w:p>
+        </w:tc>
+      </w:tr>
+      <w:tr>
+        <w:trPr>
+          <w:cantSplit/>
+        </w:trPr>
+        <w:tc>
+          <w:tcPr>
+            <w:tcW w:type="dxa" w:w="1935"/>
+          </w:tcPr>
+          <w:p>
+            <w:pPr>
+              <w:spacing w:before="0" w:after="0"/>
+            </w:pPr>
+            <w:r>
+              <w:rPr>
+                <w:sz w:val="20"/>
+              </w:rPr>
+              <w:t>Plausibility</w:t>
+            </w:r>
+          </w:p>
+        </w:tc>
+        <w:tc>
+          <w:tcPr>
+            <w:tcW w:type="dxa" w:w="4811"/>
+          </w:tcPr>
+          <w:p>
+            <w:pPr>
+              <w:spacing w:before="0" w:after="0"/>
+            </w:pPr>
+            <w:r>
+              <w:rPr>
+                <w:sz w:val="20"/>
+              </w:rPr>
+              <w:t>Presence depends on the plausibility of what happens as well as on the display (Slater and Sanchez-Vives 2016).</w:t>
+            </w:r>
+          </w:p>
+        </w:tc>
+        <w:tc>
+          <w:tcPr>
+            <w:tcW w:type="dxa" w:w="2892"/>
+          </w:tcPr>
+          <w:p>
+            <w:pPr>
+              <w:spacing w:before="0" w:after="0"/>
+            </w:pPr>
+            <w:r>
+              <w:rPr>
+                <w:sz w:val="20"/>
+              </w:rPr>
+              <w:t>Labels that drift or lag break the illusion: test tracking in the real room.</w:t>
+            </w:r>
+          </w:p>
+        </w:tc>
+      </w:tr>
+    </w:tbl>
+    <w:p>
+      <w:pPr>
+        <w:spacing w:before="0" w:after="80"/>
+      </w:pPr>
+    </w:p>
     <w:tbl>
       <w:tblPr>
         <w:tblW w:w="9598" w:type="dxa"/>
@@ -3831,7 +4351,7 @@
             </w:pPr>
             <w:r>
               <w:rPr/>
-              <w:t>Brewline, Zara, Edgar, Kim and Ruth are made up for this example; the 3D machine is a generic model. Presence follows Slater and Sanchez-Vives (2016); selective attention under load follows Lavie (2005).</w:t>
+              <w:t>Brewline, Zara, Edgar, Kim and Ruth are made up for this example; the 3D machine is a generic model. Presence follows Slater and Sanchez-Vives (2016); selective attention under load follows Lavie (2005). The findings in the table of real evidence are real research results, rules and cases; the sources are listed below.</w:t>
             </w:r>
           </w:p>
         </w:tc>
@@ -4020,7 +4540,7 @@
           <w:color w:val="556274"/>
           <w:sz w:val="18"/>
         </w:rPr>
-        <w:t>Slater &amp; Sanchez-Vives 2016 · Lavie 2005</w:t>
+        <w:t>Slater &amp; Sanchez-Vives 2016 · Lavie 2005 · Rebenitsch &amp; Owen 2016</w:t>
       </w:r>
     </w:p>
     <w:p>
@@ -4665,6 +5185,319 @@
         <w:spacing w:before="0" w:after="80"/>
       </w:pPr>
     </w:p>
+    <w:p>
+      <w:pPr>
+        <w:spacing w:before="0" w:after="100"/>
+      </w:pPr>
+      <w:r>
+        <w:rPr>
+          <w:b/>
+        </w:rPr>
+        <w:t>Intensify or overwhelm: what the evidence says</w:t>
+      </w:r>
+    </w:p>
+    <w:tbl>
+      <w:tblPr>
+        <w:tblW w:w="9638" w:type="dxa"/>
+        <w:tblBorders>
+          <w:top w:val="single" w:sz="4" w:space="0" w:color="D5DEE9"/>
+          <w:left w:val="single" w:sz="4" w:space="0" w:color="D5DEE9"/>
+          <w:bottom w:val="single" w:sz="4" w:space="0" w:color="D5DEE9"/>
+          <w:right w:val="single" w:sz="4" w:space="0" w:color="D5DEE9"/>
+          <w:insideH w:val="single" w:sz="4" w:space="0" w:color="D5DEE9"/>
+          <w:insideV w:val="single" w:sz="4" w:space="0" w:color="D5DEE9"/>
+        </w:tblBorders>
+        <w:tblLayout w:type="fixed"/>
+        <w:tblCellMar>
+          <w:top w:w="60" w:type="dxa"/>
+          <w:left w:w="100" w:type="dxa"/>
+          <w:bottom w:w="60" w:type="dxa"/>
+          <w:right w:w="100" w:type="dxa"/>
+        </w:tblCellMar>
+      </w:tblPr>
+      <w:tblGrid>
+        <w:gridCol w:w="2134"/>
+        <w:gridCol w:w="5046"/>
+        <w:gridCol w:w="2458"/>
+      </w:tblGrid>
+      <w:tr>
+        <w:trPr>
+          <w:cantSplit/>
+          <w:tblHeader/>
+        </w:trPr>
+        <w:tc>
+          <w:tcPr>
+            <w:tcW w:type="dxa" w:w="2134"/>
+            <w:shd w:val="clear" w:color="auto" w:fill="E6ECF4"/>
+          </w:tcPr>
+          <w:p>
+            <w:pPr>
+              <w:spacing w:before="0" w:after="0"/>
+            </w:pPr>
+            <w:r>
+              <w:rPr>
+                <w:b/>
+                <w:sz w:val="20"/>
+              </w:rPr>
+              <w:t>Topic</w:t>
+            </w:r>
+          </w:p>
+        </w:tc>
+        <w:tc>
+          <w:tcPr>
+            <w:tcW w:type="dxa" w:w="5046"/>
+            <w:shd w:val="clear" w:color="auto" w:fill="E6ECF4"/>
+          </w:tcPr>
+          <w:p>
+            <w:pPr>
+              <w:spacing w:before="0" w:after="0"/>
+            </w:pPr>
+            <w:r>
+              <w:rPr>
+                <w:b/>
+                <w:sz w:val="20"/>
+              </w:rPr>
+              <w:t>Real finding</w:t>
+            </w:r>
+          </w:p>
+        </w:tc>
+        <w:tc>
+          <w:tcPr>
+            <w:tcW w:type="dxa" w:w="2458"/>
+            <w:shd w:val="clear" w:color="auto" w:fill="E6ECF4"/>
+          </w:tcPr>
+          <w:p>
+            <w:pPr>
+              <w:spacing w:before="0" w:after="0"/>
+            </w:pPr>
+            <w:r>
+              <w:rPr>
+                <w:b/>
+                <w:sz w:val="20"/>
+              </w:rPr>
+              <w:t>What it means for a product</w:t>
+            </w:r>
+          </w:p>
+        </w:tc>
+      </w:tr>
+      <w:tr>
+        <w:trPr>
+          <w:cantSplit/>
+        </w:trPr>
+        <w:tc>
+          <w:tcPr>
+            <w:tcW w:type="dxa" w:w="2134"/>
+          </w:tcPr>
+          <w:p>
+            <w:pPr>
+              <w:spacing w:before="0" w:after="0"/>
+            </w:pPr>
+            <w:r>
+              <w:rPr>
+                <w:sz w:val="20"/>
+              </w:rPr>
+              <w:t>Training</w:t>
+            </w:r>
+          </w:p>
+        </w:tc>
+        <w:tc>
+          <w:tcPr>
+            <w:tcW w:type="dxa" w:w="5046"/>
+          </w:tcPr>
+          <w:p>
+            <w:pPr>
+              <w:spacing w:before="0" w:after="0"/>
+            </w:pPr>
+            <w:r>
+              <w:rPr>
+                <w:sz w:val="20"/>
+              </w:rPr>
+              <w:t>A meta-analysis of studies on the transfer of training found that training in virtual, augmented or mixed reality was about as effective as training in a non-simulated environment, not better (Kaplan et al. 2021).</w:t>
+            </w:r>
+          </w:p>
+        </w:tc>
+        <w:tc>
+          <w:tcPr>
+            <w:tcW w:type="dxa" w:w="2458"/>
+          </w:tcPr>
+          <w:p>
+            <w:pPr>
+              <w:spacing w:before="0" w:after="0"/>
+            </w:pPr>
+            <w:r>
+              <w:rPr>
+                <w:sz w:val="20"/>
+              </w:rPr>
+              <w:t>Its case rests on what the real setting cannot offer: danger, cost, access.</w:t>
+            </w:r>
+          </w:p>
+        </w:tc>
+      </w:tr>
+      <w:tr>
+        <w:trPr>
+          <w:cantSplit/>
+        </w:trPr>
+        <w:tc>
+          <w:tcPr>
+            <w:tcW w:type="dxa" w:w="2134"/>
+          </w:tcPr>
+          <w:p>
+            <w:pPr>
+              <w:spacing w:before="0" w:after="0"/>
+            </w:pPr>
+            <w:r>
+              <w:rPr>
+                <w:sz w:val="20"/>
+              </w:rPr>
+              <w:t>Visualisation and situational help</w:t>
+            </w:r>
+          </w:p>
+        </w:tc>
+        <w:tc>
+          <w:tcPr>
+            <w:tcW w:type="dxa" w:w="5046"/>
+          </w:tcPr>
+          <w:p>
+            <w:pPr>
+              <w:spacing w:before="0" w:after="0"/>
+            </w:pPr>
+            <w:r>
+              <w:rPr>
+                <w:sz w:val="20"/>
+              </w:rPr>
+              <w:t>Immersive displays can show what cannot be seen, such as the inside of a machine, but each added object adds load (Lavie 2005).</w:t>
+            </w:r>
+          </w:p>
+        </w:tc>
+        <w:tc>
+          <w:tcPr>
+            <w:tcW w:type="dxa" w:w="2458"/>
+          </w:tcPr>
+          <w:p>
+            <w:pPr>
+              <w:spacing w:before="0" w:after="0"/>
+            </w:pPr>
+            <w:r>
+              <w:rPr>
+                <w:sz w:val="20"/>
+              </w:rPr>
+              <w:t>Show the one thing the step needs.</w:t>
+            </w:r>
+          </w:p>
+        </w:tc>
+      </w:tr>
+      <w:tr>
+        <w:trPr>
+          <w:cantSplit/>
+        </w:trPr>
+        <w:tc>
+          <w:tcPr>
+            <w:tcW w:type="dxa" w:w="2134"/>
+          </w:tcPr>
+          <w:p>
+            <w:pPr>
+              <w:spacing w:before="0" w:after="0"/>
+            </w:pPr>
+            <w:r>
+              <w:rPr>
+                <w:sz w:val="20"/>
+              </w:rPr>
+              <w:t>Sickness and comfort</w:t>
+            </w:r>
+          </w:p>
+        </w:tc>
+        <w:tc>
+          <w:tcPr>
+            <w:tcW w:type="dxa" w:w="5046"/>
+          </w:tcPr>
+          <w:p>
+            <w:pPr>
+              <w:spacing w:before="0" w:after="0"/>
+            </w:pPr>
+            <w:r>
+              <w:rPr>
+                <w:sz w:val="20"/>
+              </w:rPr>
+              <w:t>A large share of users get cybersickness symptoms, with wide variation between studies (Rebenitsch and Owen 2016, as reported).</w:t>
+            </w:r>
+          </w:p>
+        </w:tc>
+        <w:tc>
+          <w:tcPr>
+            <w:tcW w:type="dxa" w:w="2458"/>
+          </w:tcPr>
+          <w:p>
+            <w:pPr>
+              <w:spacing w:before="0" w:after="0"/>
+            </w:pPr>
+            <w:r>
+              <w:rPr>
+                <w:sz w:val="20"/>
+              </w:rPr>
+              <w:t>Make the comfort option easy to find, and never rely on the long session.</w:t>
+            </w:r>
+          </w:p>
+        </w:tc>
+      </w:tr>
+      <w:tr>
+        <w:trPr>
+          <w:cantSplit/>
+        </w:trPr>
+        <w:tc>
+          <w:tcPr>
+            <w:tcW w:type="dxa" w:w="2134"/>
+          </w:tcPr>
+          <w:p>
+            <w:pPr>
+              <w:spacing w:before="0" w:after="0"/>
+            </w:pPr>
+            <w:r>
+              <w:rPr>
+                <w:sz w:val="20"/>
+              </w:rPr>
+              <w:t>Acceptance and effort</w:t>
+            </w:r>
+          </w:p>
+        </w:tc>
+        <w:tc>
+          <w:tcPr>
+            <w:tcW w:type="dxa" w:w="5046"/>
+          </w:tcPr>
+          <w:p>
+            <w:pPr>
+              <w:spacing w:before="0" w:after="0"/>
+            </w:pPr>
+            <w:r>
+              <w:rPr>
+                <w:sz w:val="20"/>
+              </w:rPr>
+              <w:t>The people and the setting decide whether it is used at all; there is no figure that holds for every product.</w:t>
+            </w:r>
+          </w:p>
+        </w:tc>
+        <w:tc>
+          <w:tcPr>
+            <w:tcW w:type="dxa" w:w="2458"/>
+          </w:tcPr>
+          <w:p>
+            <w:pPr>
+              <w:spacing w:before="0" w:after="0"/>
+            </w:pPr>
+            <w:r>
+              <w:rPr>
+                <w:sz w:val="20"/>
+              </w:rPr>
+              <w:t>Test with the actual users in the actual place.</w:t>
+            </w:r>
+          </w:p>
+        </w:tc>
+      </w:tr>
+    </w:tbl>
+    <w:p>
+      <w:pPr>
+        <w:spacing w:before="0" w:after="80"/>
+      </w:pPr>
+    </w:p>
     <w:tbl>
       <w:tblPr>
         <w:tblW w:w="9598" w:type="dxa"/>
@@ -4714,7 +5547,7 @@
             </w:pPr>
             <w:r>
               <w:rPr/>
-              <w:t>Brewline, Zara, Edgar, Kim and Ruth are made up for this example; the 3D machine is a generic model. Motion sickness in VR follows Rebenitsch and Owen (2016).</w:t>
+              <w:t>Brewline, Zara, Edgar, Kim and Ruth are made up for this example; the 3D machine is a generic model. Motion sickness in VR follows Rebenitsch and Owen (2016). The findings in the table of real evidence are real research results, rules and cases; the sources are listed below.</w:t>
             </w:r>
           </w:p>
         </w:tc>
@@ -4903,7 +5736,7 @@
           <w:color w:val="556274"/>
           <w:sz w:val="18"/>
         </w:rPr>
-        <w:t>Rebenitsch &amp; Owen 2016 · Lavie 2005</w:t>
+        <w:t>Rebenitsch &amp; Owen 2016 · Lavie 2005 · Kaplan et al. 2021</w:t>
       </w:r>
     </w:p>
     <w:p>
@@ -5138,6 +5971,266 @@
         <w:t>Figure 5 · From an idea to a product in use, and where most immersive projects stop.</w:t>
       </w:r>
     </w:p>
+    <w:p>
+      <w:pPr>
+        <w:spacing w:before="0" w:after="100"/>
+      </w:pPr>
+      <w:r>
+        <w:rPr>
+          <w:b/>
+        </w:rPr>
+        <w:t>Fascination or impact: how to test value and maturity</w:t>
+      </w:r>
+    </w:p>
+    <w:tbl>
+      <w:tblPr>
+        <w:tblW w:w="9638" w:type="dxa"/>
+        <w:tblBorders>
+          <w:top w:val="single" w:sz="4" w:space="0" w:color="D5DEE9"/>
+          <w:left w:val="single" w:sz="4" w:space="0" w:color="D5DEE9"/>
+          <w:bottom w:val="single" w:sz="4" w:space="0" w:color="D5DEE9"/>
+          <w:right w:val="single" w:sz="4" w:space="0" w:color="D5DEE9"/>
+          <w:insideH w:val="single" w:sz="4" w:space="0" w:color="D5DEE9"/>
+          <w:insideV w:val="single" w:sz="4" w:space="0" w:color="D5DEE9"/>
+        </w:tblBorders>
+        <w:tblLayout w:type="fixed"/>
+        <w:tblCellMar>
+          <w:top w:w="60" w:type="dxa"/>
+          <w:left w:w="100" w:type="dxa"/>
+          <w:bottom w:w="60" w:type="dxa"/>
+          <w:right w:w="100" w:type="dxa"/>
+        </w:tblCellMar>
+      </w:tblPr>
+      <w:tblGrid>
+        <w:gridCol w:w="1913"/>
+        <w:gridCol w:w="5020"/>
+        <w:gridCol w:w="2705"/>
+      </w:tblGrid>
+      <w:tr>
+        <w:trPr>
+          <w:cantSplit/>
+          <w:tblHeader/>
+        </w:trPr>
+        <w:tc>
+          <w:tcPr>
+            <w:tcW w:type="dxa" w:w="1913"/>
+            <w:shd w:val="clear" w:color="auto" w:fill="E6ECF4"/>
+          </w:tcPr>
+          <w:p>
+            <w:pPr>
+              <w:spacing w:before="0" w:after="0"/>
+            </w:pPr>
+            <w:r>
+              <w:rPr>
+                <w:b/>
+                <w:sz w:val="20"/>
+              </w:rPr>
+              <w:t>Source</w:t>
+            </w:r>
+          </w:p>
+        </w:tc>
+        <w:tc>
+          <w:tcPr>
+            <w:tcW w:type="dxa" w:w="5020"/>
+            <w:shd w:val="clear" w:color="auto" w:fill="E6ECF4"/>
+          </w:tcPr>
+          <w:p>
+            <w:pPr>
+              <w:spacing w:before="0" w:after="0"/>
+            </w:pPr>
+            <w:r>
+              <w:rPr>
+                <w:b/>
+                <w:sz w:val="20"/>
+              </w:rPr>
+              <w:t>Real practice</w:t>
+            </w:r>
+          </w:p>
+        </w:tc>
+        <w:tc>
+          <w:tcPr>
+            <w:tcW w:type="dxa" w:w="2705"/>
+            <w:shd w:val="clear" w:color="auto" w:fill="E6ECF4"/>
+          </w:tcPr>
+          <w:p>
+            <w:pPr>
+              <w:spacing w:before="0" w:after="0"/>
+            </w:pPr>
+            <w:r>
+              <w:rPr>
+                <w:b/>
+                <w:sz w:val="20"/>
+              </w:rPr>
+              <w:t>What it means for a decision</w:t>
+            </w:r>
+          </w:p>
+        </w:tc>
+      </w:tr>
+      <w:tr>
+        <w:trPr>
+          <w:cantSplit/>
+        </w:trPr>
+        <w:tc>
+          <w:tcPr>
+            <w:tcW w:type="dxa" w:w="1913"/>
+          </w:tcPr>
+          <w:p>
+            <w:pPr>
+              <w:spacing w:before="0" w:after="0"/>
+            </w:pPr>
+            <w:r>
+              <w:rPr>
+                <w:sz w:val="20"/>
+              </w:rPr>
+              <w:t>Test the riskiest assumption</w:t>
+            </w:r>
+          </w:p>
+        </w:tc>
+        <w:tc>
+          <w:tcPr>
+            <w:tcW w:type="dxa" w:w="5020"/>
+          </w:tcPr>
+          <w:p>
+            <w:pPr>
+              <w:spacing w:before="0" w:after="0"/>
+            </w:pPr>
+            <w:r>
+              <w:rPr>
+                <w:sz w:val="20"/>
+              </w:rPr>
+              <w:t>The GOV.UK Service Manual advises to define the problem, to test the riskiest assumptions with throwaway prototypes and to decide on the evidence, including the decision to stop (GOV.UK Service Manual).</w:t>
+            </w:r>
+          </w:p>
+        </w:tc>
+        <w:tc>
+          <w:tcPr>
+            <w:tcW w:type="dxa" w:w="2705"/>
+          </w:tcPr>
+          <w:p>
+            <w:pPr>
+              <w:spacing w:before="0" w:after="0"/>
+            </w:pPr>
+            <w:r>
+              <w:rPr>
+                <w:sz w:val="20"/>
+              </w:rPr>
+              <w:t>Start with a cheap test of the value, not with a build.</w:t>
+            </w:r>
+          </w:p>
+        </w:tc>
+      </w:tr>
+      <w:tr>
+        <w:trPr>
+          <w:cantSplit/>
+        </w:trPr>
+        <w:tc>
+          <w:tcPr>
+            <w:tcW w:type="dxa" w:w="1913"/>
+          </w:tcPr>
+          <w:p>
+            <w:pPr>
+              <w:spacing w:before="0" w:after="0"/>
+            </w:pPr>
+            <w:r>
+              <w:rPr>
+                <w:sz w:val="20"/>
+              </w:rPr>
+              <w:t>The case for the real setting</w:t>
+            </w:r>
+          </w:p>
+        </w:tc>
+        <w:tc>
+          <w:tcPr>
+            <w:tcW w:type="dxa" w:w="5020"/>
+          </w:tcPr>
+          <w:p>
+            <w:pPr>
+              <w:spacing w:before="0" w:after="0"/>
+            </w:pPr>
+            <w:r>
+              <w:rPr>
+                <w:sz w:val="20"/>
+              </w:rPr>
+              <w:t>Training in extended reality was equally effective as non-simulated training (Kaplan et al. 2021).</w:t>
+            </w:r>
+          </w:p>
+        </w:tc>
+        <w:tc>
+          <w:tcPr>
+            <w:tcW w:type="dxa" w:w="2705"/>
+          </w:tcPr>
+          <w:p>
+            <w:pPr>
+              <w:spacing w:before="0" w:after="0"/>
+            </w:pPr>
+            <w:r>
+              <w:rPr>
+                <w:sz w:val="20"/>
+              </w:rPr>
+              <w:t>Use immersive technology where the real thing is dangerous, rare or expensive.</w:t>
+            </w:r>
+          </w:p>
+        </w:tc>
+      </w:tr>
+      <w:tr>
+        <w:trPr>
+          <w:cantSplit/>
+        </w:trPr>
+        <w:tc>
+          <w:tcPr>
+            <w:tcW w:type="dxa" w:w="1913"/>
+          </w:tcPr>
+          <w:p>
+            <w:pPr>
+              <w:spacing w:before="0" w:after="0"/>
+            </w:pPr>
+            <w:r>
+              <w:rPr>
+                <w:sz w:val="20"/>
+              </w:rPr>
+              <w:t>Phases and assessment</w:t>
+            </w:r>
+          </w:p>
+        </w:tc>
+        <w:tc>
+          <w:tcPr>
+            <w:tcW w:type="dxa" w:w="5020"/>
+          </w:tcPr>
+          <w:p>
+            <w:pPr>
+              <w:spacing w:before="0" w:after="0"/>
+            </w:pPr>
+            <w:r>
+              <w:rPr>
+                <w:sz w:val="20"/>
+              </w:rPr>
+              <w:t>Services in the UK government are assessed against the Service Standard at the discovery, alpha, beta and live phases (GOV.UK Service Standard).</w:t>
+            </w:r>
+          </w:p>
+        </w:tc>
+        <w:tc>
+          <w:tcPr>
+            <w:tcW w:type="dxa" w:w="2705"/>
+          </w:tcPr>
+          <w:p>
+            <w:pPr>
+              <w:spacing w:before="0" w:after="0"/>
+            </w:pPr>
+            <w:r>
+              <w:rPr>
+                <w:sz w:val="20"/>
+              </w:rPr>
+              <w:t>Define what a pilot must show before it may grow.</w:t>
+            </w:r>
+          </w:p>
+        </w:tc>
+      </w:tr>
+    </w:tbl>
+    <w:p>
+      <w:pPr>
+        <w:spacing w:before="0" w:after="80"/>
+      </w:pPr>
+    </w:p>
     <w:tbl>
       <w:tblPr>
         <w:tblW w:w="9598" w:type="dxa"/>
@@ -5187,7 +6280,7 @@
             </w:pPr>
             <w:r>
               <w:rPr/>
-              <w:t>Brewline, Zara, Edgar, Kim and Ruth are made up for this example; the 3D machine is a generic model. Reserving immersion for meaningful moments follows Apple's guidelines; reframing a solution as a problem follows the GOV.UK Service Manual.</w:t>
+              <w:t>Brewline, Zara, Edgar, Kim and Ruth are made up for this example; the 3D machine is a generic model. Reserving immersion for meaningful moments follows Apple's guidelines; reframing a solution as a problem follows the GOV.UK Service Manual. The findings in the table of real evidence are real research results, rules and cases; the sources are listed below.</w:t>
             </w:r>
           </w:p>
         </w:tc>
@@ -5376,7 +6469,7 @@
           <w:color w:val="556274"/>
           <w:sz w:val="18"/>
         </w:rPr>
-        <w:t>GOV.UK Service Manual · Apple HIG</w:t>
+        <w:t>GOV.UK Service Manual · Apple HIG · Kaplan et al. 2021 · GOV.UK Service Standard</w:t>
       </w:r>
     </w:p>
     <w:p>
@@ -5611,6 +6704,266 @@
         <w:t>Figure 7 · Brewline weighs three measures on effect on users, feasibility, risk, time pressure and investment security.</w:t>
       </w:r>
     </w:p>
+    <w:p>
+      <w:pPr>
+        <w:spacing w:before="0" w:after="100"/>
+      </w:pPr>
+      <w:r>
+        <w:rPr>
+          <w:b/>
+        </w:rPr>
+        <w:t>Ethics and responsibility: a real finding</w:t>
+      </w:r>
+    </w:p>
+    <w:tbl>
+      <w:tblPr>
+        <w:tblW w:w="9638" w:type="dxa"/>
+        <w:tblBorders>
+          <w:top w:val="single" w:sz="4" w:space="0" w:color="D5DEE9"/>
+          <w:left w:val="single" w:sz="4" w:space="0" w:color="D5DEE9"/>
+          <w:bottom w:val="single" w:sz="4" w:space="0" w:color="D5DEE9"/>
+          <w:right w:val="single" w:sz="4" w:space="0" w:color="D5DEE9"/>
+          <w:insideH w:val="single" w:sz="4" w:space="0" w:color="D5DEE9"/>
+          <w:insideV w:val="single" w:sz="4" w:space="0" w:color="D5DEE9"/>
+        </w:tblBorders>
+        <w:tblLayout w:type="fixed"/>
+        <w:tblCellMar>
+          <w:top w:w="60" w:type="dxa"/>
+          <w:left w:w="100" w:type="dxa"/>
+          <w:bottom w:w="60" w:type="dxa"/>
+          <w:right w:w="100" w:type="dxa"/>
+        </w:tblCellMar>
+      </w:tblPr>
+      <w:tblGrid>
+        <w:gridCol w:w="2247"/>
+        <w:gridCol w:w="4970"/>
+        <w:gridCol w:w="2421"/>
+      </w:tblGrid>
+      <w:tr>
+        <w:trPr>
+          <w:cantSplit/>
+          <w:tblHeader/>
+        </w:trPr>
+        <w:tc>
+          <w:tcPr>
+            <w:tcW w:type="dxa" w:w="2247"/>
+            <w:shd w:val="clear" w:color="auto" w:fill="E6ECF4"/>
+          </w:tcPr>
+          <w:p>
+            <w:pPr>
+              <w:spacing w:before="0" w:after="0"/>
+            </w:pPr>
+            <w:r>
+              <w:rPr>
+                <w:b/>
+                <w:sz w:val="20"/>
+              </w:rPr>
+              <w:t>Topic</w:t>
+            </w:r>
+          </w:p>
+        </w:tc>
+        <w:tc>
+          <w:tcPr>
+            <w:tcW w:type="dxa" w:w="4970"/>
+            <w:shd w:val="clear" w:color="auto" w:fill="E6ECF4"/>
+          </w:tcPr>
+          <w:p>
+            <w:pPr>
+              <w:spacing w:before="0" w:after="0"/>
+            </w:pPr>
+            <w:r>
+              <w:rPr>
+                <w:b/>
+                <w:sz w:val="20"/>
+              </w:rPr>
+              <w:t>Real finding</w:t>
+            </w:r>
+          </w:p>
+        </w:tc>
+        <w:tc>
+          <w:tcPr>
+            <w:tcW w:type="dxa" w:w="2421"/>
+            <w:shd w:val="clear" w:color="auto" w:fill="E6ECF4"/>
+          </w:tcPr>
+          <w:p>
+            <w:pPr>
+              <w:spacing w:before="0" w:after="0"/>
+            </w:pPr>
+            <w:r>
+              <w:rPr>
+                <w:b/>
+                <w:sz w:val="20"/>
+              </w:rPr>
+              <w:t>What it means for a measure</w:t>
+            </w:r>
+          </w:p>
+        </w:tc>
+      </w:tr>
+      <w:tr>
+        <w:trPr>
+          <w:cantSplit/>
+        </w:trPr>
+        <w:tc>
+          <w:tcPr>
+            <w:tcW w:type="dxa" w:w="2247"/>
+          </w:tcPr>
+          <w:p>
+            <w:pPr>
+              <w:spacing w:before="0" w:after="0"/>
+            </w:pPr>
+            <w:r>
+              <w:rPr>
+                <w:sz w:val="20"/>
+              </w:rPr>
+              <w:t>Identifiability of movement</w:t>
+            </w:r>
+          </w:p>
+        </w:tc>
+        <w:tc>
+          <w:tcPr>
+            <w:tcW w:type="dxa" w:w="4970"/>
+          </w:tcPr>
+          <w:p>
+            <w:pPr>
+              <w:spacing w:before="0" w:after="0"/>
+            </w:pPr>
+            <w:r>
+              <w:rPr>
+                <w:sz w:val="20"/>
+              </w:rPr>
+              <w:t>In a study with more than 500 participants who watched 360-degree videos, a simple model identified people with above 95% accuracy from less than five minutes of head and hand tracking data (Miller et al. 2020, as reported).</w:t>
+            </w:r>
+          </w:p>
+        </w:tc>
+        <w:tc>
+          <w:tcPr>
+            <w:tcW w:type="dxa" w:w="2421"/>
+          </w:tcPr>
+          <w:p>
+            <w:pPr>
+              <w:spacing w:before="0" w:after="0"/>
+            </w:pPr>
+            <w:r>
+              <w:rPr>
+                <w:sz w:val="20"/>
+              </w:rPr>
+              <w:t>Treat motion data as personal data, even without a name attached.</w:t>
+            </w:r>
+          </w:p>
+        </w:tc>
+      </w:tr>
+      <w:tr>
+        <w:trPr>
+          <w:cantSplit/>
+        </w:trPr>
+        <w:tc>
+          <w:tcPr>
+            <w:tcW w:type="dxa" w:w="2247"/>
+          </w:tcPr>
+          <w:p>
+            <w:pPr>
+              <w:spacing w:before="0" w:after="0"/>
+            </w:pPr>
+            <w:r>
+              <w:rPr>
+                <w:sz w:val="20"/>
+              </w:rPr>
+              <w:t>Comfort and choice</w:t>
+            </w:r>
+          </w:p>
+        </w:tc>
+        <w:tc>
+          <w:tcPr>
+            <w:tcW w:type="dxa" w:w="4970"/>
+          </w:tcPr>
+          <w:p>
+            <w:pPr>
+              <w:spacing w:before="0" w:after="0"/>
+            </w:pPr>
+            <w:r>
+              <w:rPr>
+                <w:sz w:val="20"/>
+              </w:rPr>
+              <w:t>Apple's guidelines ask that people choose when to enter and exit an immersive experience and that comfort is considered (Apple, Immersive experiences).</w:t>
+            </w:r>
+          </w:p>
+        </w:tc>
+        <w:tc>
+          <w:tcPr>
+            <w:tcW w:type="dxa" w:w="2421"/>
+          </w:tcPr>
+          <w:p>
+            <w:pPr>
+              <w:spacing w:before="0" w:after="0"/>
+            </w:pPr>
+            <w:r>
+              <w:rPr>
+                <w:sz w:val="20"/>
+              </w:rPr>
+              <w:t>Build consent, comfort and an exit into the first version.</w:t>
+            </w:r>
+          </w:p>
+        </w:tc>
+      </w:tr>
+      <w:tr>
+        <w:trPr>
+          <w:cantSplit/>
+        </w:trPr>
+        <w:tc>
+          <w:tcPr>
+            <w:tcW w:type="dxa" w:w="2247"/>
+          </w:tcPr>
+          <w:p>
+            <w:pPr>
+              <w:spacing w:before="0" w:after="0"/>
+            </w:pPr>
+            <w:r>
+              <w:rPr>
+                <w:sz w:val="20"/>
+              </w:rPr>
+              <w:t>Who is harmed</w:t>
+            </w:r>
+          </w:p>
+        </w:tc>
+        <w:tc>
+          <w:tcPr>
+            <w:tcW w:type="dxa" w:w="4970"/>
+          </w:tcPr>
+          <w:p>
+            <w:pPr>
+              <w:spacing w:before="0" w:after="0"/>
+            </w:pPr>
+            <w:r>
+              <w:rPr>
+                <w:sz w:val="20"/>
+              </w:rPr>
+              <w:t>Sickness, disorientation and data exposure fall on the user (Rebenitsch and Owen 2016; Miller et al. 2020).</w:t>
+            </w:r>
+          </w:p>
+        </w:tc>
+        <w:tc>
+          <w:tcPr>
+            <w:tcW w:type="dxa" w:w="2421"/>
+          </w:tcPr>
+          <w:p>
+            <w:pPr>
+              <w:spacing w:before="0" w:after="0"/>
+            </w:pPr>
+            <w:r>
+              <w:rPr>
+                <w:sz w:val="20"/>
+              </w:rPr>
+              <w:t>Ask who could be harmed before asking what could be shown.</w:t>
+            </w:r>
+          </w:p>
+        </w:tc>
+      </w:tr>
+    </w:tbl>
+    <w:p>
+      <w:pPr>
+        <w:spacing w:before="0" w:after="80"/>
+      </w:pPr>
+    </w:p>
     <w:tbl>
       <w:tblPr>
         <w:tblW w:w="9598" w:type="dxa"/>
@@ -5660,7 +7013,7 @@
             </w:pPr>
             <w:r>
               <w:rPr/>
-              <w:t>Brewline, Zara, Edgar, Kim and Ruth are made up for this example; the 3D machine is a generic model. Rating options on the same criteria follows Gibbons (2018); the five criteria are the ones the plan names for the case study.</w:t>
+              <w:t>Brewline, Zara, Edgar, Kim and Ruth are made up for this example; the 3D machine is a generic model. Rating options on the same criteria follows Gibbons (2018); the five criteria are the ones the plan names for the case study. The findings in the table of real evidence are real research results, rules and cases; the sources are listed below.</w:t>
             </w:r>
           </w:p>
         </w:tc>
@@ -5849,7 +7202,7 @@
           <w:color w:val="556274"/>
           <w:sz w:val="18"/>
         </w:rPr>
-        <w:t>Rebenitsch &amp; Owen 2016 · Gibbons 2018</w:t>
+        <w:t>Rebenitsch &amp; Owen 2016 · Gibbons 2018 · Miller et al. 2020 · Apple HIG</w:t>
       </w:r>
     </w:p>
     <w:p>
@@ -6156,6 +7509,266 @@
         <w:t>Figure 9 · The layers of an innovation architecture, from a guiding vision to every pilot.</w:t>
       </w:r>
     </w:p>
+    <w:p>
+      <w:pPr>
+        <w:spacing w:before="0" w:after="100"/>
+      </w:pPr>
+      <w:r>
+        <w:rPr>
+          <w:b/>
+        </w:rPr>
+        <w:t>Future technologies as decision architecture: structures</w:t>
+      </w:r>
+    </w:p>
+    <w:tbl>
+      <w:tblPr>
+        <w:tblW w:w="9638" w:type="dxa"/>
+        <w:tblBorders>
+          <w:top w:val="single" w:sz="4" w:space="0" w:color="D5DEE9"/>
+          <w:left w:val="single" w:sz="4" w:space="0" w:color="D5DEE9"/>
+          <w:bottom w:val="single" w:sz="4" w:space="0" w:color="D5DEE9"/>
+          <w:right w:val="single" w:sz="4" w:space="0" w:color="D5DEE9"/>
+          <w:insideH w:val="single" w:sz="4" w:space="0" w:color="D5DEE9"/>
+          <w:insideV w:val="single" w:sz="4" w:space="0" w:color="D5DEE9"/>
+        </w:tblBorders>
+        <w:tblLayout w:type="fixed"/>
+        <w:tblCellMar>
+          <w:top w:w="60" w:type="dxa"/>
+          <w:left w:w="100" w:type="dxa"/>
+          <w:bottom w:w="60" w:type="dxa"/>
+          <w:right w:w="100" w:type="dxa"/>
+        </w:tblCellMar>
+      </w:tblPr>
+      <w:tblGrid>
+        <w:gridCol w:w="1523"/>
+        <w:gridCol w:w="5295"/>
+        <w:gridCol w:w="2820"/>
+      </w:tblGrid>
+      <w:tr>
+        <w:trPr>
+          <w:cantSplit/>
+          <w:tblHeader/>
+        </w:trPr>
+        <w:tc>
+          <w:tcPr>
+            <w:tcW w:type="dxa" w:w="1523"/>
+            <w:shd w:val="clear" w:color="auto" w:fill="E6ECF4"/>
+          </w:tcPr>
+          <w:p>
+            <w:pPr>
+              <w:spacing w:before="0" w:after="0"/>
+            </w:pPr>
+            <w:r>
+              <w:rPr>
+                <w:b/>
+                <w:sz w:val="20"/>
+              </w:rPr>
+              <w:t>Part</w:t>
+            </w:r>
+          </w:p>
+        </w:tc>
+        <w:tc>
+          <w:tcPr>
+            <w:tcW w:type="dxa" w:w="5295"/>
+            <w:shd w:val="clear" w:color="auto" w:fill="E6ECF4"/>
+          </w:tcPr>
+          <w:p>
+            <w:pPr>
+              <w:spacing w:before="0" w:after="0"/>
+            </w:pPr>
+            <w:r>
+              <w:rPr>
+                <w:b/>
+                <w:sz w:val="20"/>
+              </w:rPr>
+              <w:t>Real example</w:t>
+            </w:r>
+          </w:p>
+        </w:tc>
+        <w:tc>
+          <w:tcPr>
+            <w:tcW w:type="dxa" w:w="2820"/>
+            <w:shd w:val="clear" w:color="auto" w:fill="E6ECF4"/>
+          </w:tcPr>
+          <w:p>
+            <w:pPr>
+              <w:spacing w:before="0" w:after="0"/>
+            </w:pPr>
+            <w:r>
+              <w:rPr>
+                <w:b/>
+                <w:sz w:val="20"/>
+              </w:rPr>
+              <w:t>What it means</w:t>
+            </w:r>
+          </w:p>
+        </w:tc>
+      </w:tr>
+      <w:tr>
+        <w:trPr>
+          <w:cantSplit/>
+        </w:trPr>
+        <w:tc>
+          <w:tcPr>
+            <w:tcW w:type="dxa" w:w="1523"/>
+          </w:tcPr>
+          <w:p>
+            <w:pPr>
+              <w:spacing w:before="0" w:after="0"/>
+            </w:pPr>
+            <w:r>
+              <w:rPr>
+                <w:sz w:val="20"/>
+              </w:rPr>
+              <w:t>A map of the field</w:t>
+            </w:r>
+          </w:p>
+        </w:tc>
+        <w:tc>
+          <w:tcPr>
+            <w:tcW w:type="dxa" w:w="5295"/>
+          </w:tcPr>
+          <w:p>
+            <w:pPr>
+              <w:spacing w:before="0" w:after="0"/>
+            </w:pPr>
+            <w:r>
+              <w:rPr>
+                <w:sz w:val="20"/>
+              </w:rPr>
+              <w:t>The reality–virtuality continuum organises the technologies into one map (Milgram and Kishino 1994).</w:t>
+            </w:r>
+          </w:p>
+        </w:tc>
+        <w:tc>
+          <w:tcPr>
+            <w:tcW w:type="dxa" w:w="2820"/>
+          </w:tcPr>
+          <w:p>
+            <w:pPr>
+              <w:spacing w:before="0" w:after="0"/>
+            </w:pPr>
+            <w:r>
+              <w:rPr>
+                <w:sz w:val="20"/>
+              </w:rPr>
+              <w:t>Use one map for the portfolio, so bets are comparable.</w:t>
+            </w:r>
+          </w:p>
+        </w:tc>
+      </w:tr>
+      <w:tr>
+        <w:trPr>
+          <w:cantSplit/>
+        </w:trPr>
+        <w:tc>
+          <w:tcPr>
+            <w:tcW w:type="dxa" w:w="1523"/>
+          </w:tcPr>
+          <w:p>
+            <w:pPr>
+              <w:spacing w:before="0" w:after="0"/>
+            </w:pPr>
+            <w:r>
+              <w:rPr>
+                <w:sz w:val="20"/>
+              </w:rPr>
+              <w:t>Phased evidence</w:t>
+            </w:r>
+          </w:p>
+        </w:tc>
+        <w:tc>
+          <w:tcPr>
+            <w:tcW w:type="dxa" w:w="5295"/>
+          </w:tcPr>
+          <w:p>
+            <w:pPr>
+              <w:spacing w:before="0" w:after="0"/>
+            </w:pPr>
+            <w:r>
+              <w:rPr>
+                <w:sz w:val="20"/>
+              </w:rPr>
+              <w:t>The GOV.UK phases move from discovery to alpha, beta and live, each with a test of the riskiest assumption (GOV.UK Service Manual).</w:t>
+            </w:r>
+          </w:p>
+        </w:tc>
+        <w:tc>
+          <w:tcPr>
+            <w:tcW w:type="dxa" w:w="2820"/>
+          </w:tcPr>
+          <w:p>
+            <w:pPr>
+              <w:spacing w:before="0" w:after="0"/>
+            </w:pPr>
+            <w:r>
+              <w:rPr>
+                <w:sz w:val="20"/>
+              </w:rPr>
+              <w:t>Give each bet a phase and a question.</w:t>
+            </w:r>
+          </w:p>
+        </w:tc>
+      </w:tr>
+      <w:tr>
+        <w:trPr>
+          <w:cantSplit/>
+        </w:trPr>
+        <w:tc>
+          <w:tcPr>
+            <w:tcW w:type="dxa" w:w="1523"/>
+          </w:tcPr>
+          <w:p>
+            <w:pPr>
+              <w:spacing w:before="0" w:after="0"/>
+            </w:pPr>
+            <w:r>
+              <w:rPr>
+                <w:sz w:val="20"/>
+              </w:rPr>
+              <w:t>Platform rules</w:t>
+            </w:r>
+          </w:p>
+        </w:tc>
+        <w:tc>
+          <w:tcPr>
+            <w:tcW w:type="dxa" w:w="5295"/>
+          </w:tcPr>
+          <w:p>
+            <w:pPr>
+              <w:spacing w:before="0" w:after="0"/>
+            </w:pPr>
+            <w:r>
+              <w:rPr>
+                <w:sz w:val="20"/>
+              </w:rPr>
+              <w:t>Apple's guidelines set expectations for comfort and for entering and leaving immersion (Apple, Immersive experiences).</w:t>
+            </w:r>
+          </w:p>
+        </w:tc>
+        <w:tc>
+          <w:tcPr>
+            <w:tcW w:type="dxa" w:w="2820"/>
+          </w:tcPr>
+          <w:p>
+            <w:pPr>
+              <w:spacing w:before="0" w:after="0"/>
+            </w:pPr>
+            <w:r>
+              <w:rPr>
+                <w:sz w:val="20"/>
+              </w:rPr>
+              <w:t>Build on the rules of the platform instead of inventing your own.</w:t>
+            </w:r>
+          </w:p>
+        </w:tc>
+      </w:tr>
+    </w:tbl>
+    <w:p>
+      <w:pPr>
+        <w:spacing w:before="0" w:after="80"/>
+      </w:pPr>
+    </w:p>
     <w:tbl>
       <w:tblPr>
         <w:tblW w:w="9598" w:type="dxa"/>
@@ -6205,7 +7818,7 @@
             </w:pPr>
             <w:r>
               <w:rPr/>
-              <w:t>Brewline, Zara, Edgar, Kim and Ruth are made up for this example; the 3D machine is a generic model. Discovery, alpha and the decision to go on or stop follow the GOV.UK Service Manual.</w:t>
+              <w:t>Brewline, Zara, Edgar, Kim and Ruth are made up for this example; the 3D machine is a generic model. Discovery, alpha and the decision to go on or stop follow the GOV.UK Service Manual. The findings in the table of real evidence are real research results, rules and cases; the sources are listed below.</w:t>
             </w:r>
           </w:p>
         </w:tc>
@@ -6394,7 +8007,7 @@
           <w:color w:val="556274"/>
           <w:sz w:val="18"/>
         </w:rPr>
-        <w:t>GOV.UK Service Manual · Apple HIG</w:t>
+        <w:t>GOV.UK Service Manual · Apple HIG · Milgram &amp; Kishino 1994</w:t>
       </w:r>
     </w:p>
     <w:p>
@@ -6887,6 +8500,319 @@
         <w:spacing w:before="0" w:after="80"/>
       </w:pPr>
     </w:p>
+    <w:p>
+      <w:pPr>
+        <w:spacing w:before="0" w:after="100"/>
+      </w:pPr>
+      <w:r>
+        <w:rPr>
+          <w:b/>
+        </w:rPr>
+        <w:t>Conflicts of the future, with evidence</w:t>
+      </w:r>
+    </w:p>
+    <w:tbl>
+      <w:tblPr>
+        <w:tblW w:w="9638" w:type="dxa"/>
+        <w:tblBorders>
+          <w:top w:val="single" w:sz="4" w:space="0" w:color="D5DEE9"/>
+          <w:left w:val="single" w:sz="4" w:space="0" w:color="D5DEE9"/>
+          <w:bottom w:val="single" w:sz="4" w:space="0" w:color="D5DEE9"/>
+          <w:right w:val="single" w:sz="4" w:space="0" w:color="D5DEE9"/>
+          <w:insideH w:val="single" w:sz="4" w:space="0" w:color="D5DEE9"/>
+          <w:insideV w:val="single" w:sz="4" w:space="0" w:color="D5DEE9"/>
+        </w:tblBorders>
+        <w:tblLayout w:type="fixed"/>
+        <w:tblCellMar>
+          <w:top w:w="60" w:type="dxa"/>
+          <w:left w:w="100" w:type="dxa"/>
+          <w:bottom w:w="60" w:type="dxa"/>
+          <w:right w:w="100" w:type="dxa"/>
+        </w:tblCellMar>
+      </w:tblPr>
+      <w:tblGrid>
+        <w:gridCol w:w="2088"/>
+        <w:gridCol w:w="4604"/>
+        <w:gridCol w:w="2946"/>
+      </w:tblGrid>
+      <w:tr>
+        <w:trPr>
+          <w:cantSplit/>
+          <w:tblHeader/>
+        </w:trPr>
+        <w:tc>
+          <w:tcPr>
+            <w:tcW w:type="dxa" w:w="2088"/>
+            <w:shd w:val="clear" w:color="auto" w:fill="E6ECF4"/>
+          </w:tcPr>
+          <w:p>
+            <w:pPr>
+              <w:spacing w:before="0" w:after="0"/>
+            </w:pPr>
+            <w:r>
+              <w:rPr>
+                <w:b/>
+                <w:sz w:val="20"/>
+              </w:rPr>
+              <w:t>Conflict</w:t>
+            </w:r>
+          </w:p>
+        </w:tc>
+        <w:tc>
+          <w:tcPr>
+            <w:tcW w:type="dxa" w:w="4604"/>
+            <w:shd w:val="clear" w:color="auto" w:fill="E6ECF4"/>
+          </w:tcPr>
+          <w:p>
+            <w:pPr>
+              <w:spacing w:before="0" w:after="0"/>
+            </w:pPr>
+            <w:r>
+              <w:rPr>
+                <w:b/>
+                <w:sz w:val="20"/>
+              </w:rPr>
+              <w:t>What the evidence says</w:t>
+            </w:r>
+          </w:p>
+        </w:tc>
+        <w:tc>
+          <w:tcPr>
+            <w:tcW w:type="dxa" w:w="2946"/>
+            <w:shd w:val="clear" w:color="auto" w:fill="E6ECF4"/>
+          </w:tcPr>
+          <w:p>
+            <w:pPr>
+              <w:spacing w:before="0" w:after="0"/>
+            </w:pPr>
+            <w:r>
+              <w:rPr>
+                <w:b/>
+                <w:sz w:val="20"/>
+              </w:rPr>
+              <w:t>A way to decide</w:t>
+            </w:r>
+          </w:p>
+        </w:tc>
+      </w:tr>
+      <w:tr>
+        <w:trPr>
+          <w:cantSplit/>
+        </w:trPr>
+        <w:tc>
+          <w:tcPr>
+            <w:tcW w:type="dxa" w:w="2088"/>
+          </w:tcPr>
+          <w:p>
+            <w:pPr>
+              <w:spacing w:before="0" w:after="0"/>
+            </w:pPr>
+            <w:r>
+              <w:rPr>
+                <w:sz w:val="20"/>
+              </w:rPr>
+              <w:t>Innovation against user value</w:t>
+            </w:r>
+          </w:p>
+        </w:tc>
+        <w:tc>
+          <w:tcPr>
+            <w:tcW w:type="dxa" w:w="4604"/>
+          </w:tcPr>
+          <w:p>
+            <w:pPr>
+              <w:spacing w:before="0" w:after="0"/>
+            </w:pPr>
+            <w:r>
+              <w:rPr>
+                <w:sz w:val="20"/>
+              </w:rPr>
+              <w:t>Training in extended reality was about as effective as non-simulated training, not more (Kaplan et al. 2021).</w:t>
+            </w:r>
+          </w:p>
+        </w:tc>
+        <w:tc>
+          <w:tcPr>
+            <w:tcW w:type="dxa" w:w="2946"/>
+          </w:tcPr>
+          <w:p>
+            <w:pPr>
+              <w:spacing w:before="0" w:after="0"/>
+            </w:pPr>
+            <w:r>
+              <w:rPr>
+                <w:sz w:val="20"/>
+              </w:rPr>
+              <w:t>Ask which user problem it solves better than the plain way.</w:t>
+            </w:r>
+          </w:p>
+        </w:tc>
+      </w:tr>
+      <w:tr>
+        <w:trPr>
+          <w:cantSplit/>
+        </w:trPr>
+        <w:tc>
+          <w:tcPr>
+            <w:tcW w:type="dxa" w:w="2088"/>
+          </w:tcPr>
+          <w:p>
+            <w:pPr>
+              <w:spacing w:before="0" w:after="0"/>
+            </w:pPr>
+            <w:r>
+              <w:rPr>
+                <w:sz w:val="20"/>
+              </w:rPr>
+              <w:t>Visibility against maturity</w:t>
+            </w:r>
+          </w:p>
+        </w:tc>
+        <w:tc>
+          <w:tcPr>
+            <w:tcW w:type="dxa" w:w="4604"/>
+          </w:tcPr>
+          <w:p>
+            <w:pPr>
+              <w:spacing w:before="0" w:after="0"/>
+            </w:pPr>
+            <w:r>
+              <w:rPr>
+                <w:sz w:val="20"/>
+              </w:rPr>
+              <w:t>Cybersickness estimates range from about 30% to 80% of users in the reviewed work (Rebenitsch and Owen 2016, as reported).</w:t>
+            </w:r>
+          </w:p>
+        </w:tc>
+        <w:tc>
+          <w:tcPr>
+            <w:tcW w:type="dxa" w:w="2946"/>
+          </w:tcPr>
+          <w:p>
+            <w:pPr>
+              <w:spacing w:before="0" w:after="0"/>
+            </w:pPr>
+            <w:r>
+              <w:rPr>
+                <w:sz w:val="20"/>
+              </w:rPr>
+              <w:t>Show it only where it works in the real environment, at scale.</w:t>
+            </w:r>
+          </w:p>
+        </w:tc>
+      </w:tr>
+      <w:tr>
+        <w:trPr>
+          <w:cantSplit/>
+        </w:trPr>
+        <w:tc>
+          <w:tcPr>
+            <w:tcW w:type="dxa" w:w="2088"/>
+          </w:tcPr>
+          <w:p>
+            <w:pPr>
+              <w:spacing w:before="0" w:after="0"/>
+            </w:pPr>
+            <w:r>
+              <w:rPr>
+                <w:sz w:val="20"/>
+              </w:rPr>
+              <w:t>Investment risk against falling behind</w:t>
+            </w:r>
+          </w:p>
+        </w:tc>
+        <w:tc>
+          <w:tcPr>
+            <w:tcW w:type="dxa" w:w="4604"/>
+          </w:tcPr>
+          <w:p>
+            <w:pPr>
+              <w:spacing w:before="0" w:after="0"/>
+            </w:pPr>
+            <w:r>
+              <w:rPr>
+                <w:sz w:val="20"/>
+              </w:rPr>
+              <w:t>Government practice tests the riskiest assumption with a throwaway prototype first (GOV.UK Service Manual).</w:t>
+            </w:r>
+          </w:p>
+        </w:tc>
+        <w:tc>
+          <w:tcPr>
+            <w:tcW w:type="dxa" w:w="2946"/>
+          </w:tcPr>
+          <w:p>
+            <w:pPr>
+              <w:spacing w:before="0" w:after="0"/>
+            </w:pPr>
+            <w:r>
+              <w:rPr>
+                <w:sz w:val="20"/>
+              </w:rPr>
+              <w:t>Choose the smallest bet that teaches enough.</w:t>
+            </w:r>
+          </w:p>
+        </w:tc>
+      </w:tr>
+      <w:tr>
+        <w:trPr>
+          <w:cantSplit/>
+        </w:trPr>
+        <w:tc>
+          <w:tcPr>
+            <w:tcW w:type="dxa" w:w="2088"/>
+          </w:tcPr>
+          <w:p>
+            <w:pPr>
+              <w:spacing w:before="0" w:after="0"/>
+            </w:pPr>
+            <w:r>
+              <w:rPr>
+                <w:sz w:val="20"/>
+              </w:rPr>
+              <w:t>Ethics against speed</w:t>
+            </w:r>
+          </w:p>
+        </w:tc>
+        <w:tc>
+          <w:tcPr>
+            <w:tcW w:type="dxa" w:w="4604"/>
+          </w:tcPr>
+          <w:p>
+            <w:pPr>
+              <w:spacing w:before="0" w:after="0"/>
+            </w:pPr>
+            <w:r>
+              <w:rPr>
+                <w:sz w:val="20"/>
+              </w:rPr>
+              <w:t>Tracking data of five minutes can identify a person among hundreds (Miller et al. 2020, as reported).</w:t>
+            </w:r>
+          </w:p>
+        </w:tc>
+        <w:tc>
+          <w:tcPr>
+            <w:tcW w:type="dxa" w:w="2946"/>
+          </w:tcPr>
+          <w:p>
+            <w:pPr>
+              <w:spacing w:before="0" w:after="0"/>
+            </w:pPr>
+            <w:r>
+              <w:rPr>
+                <w:sz w:val="20"/>
+              </w:rPr>
+              <w:t>Ask what it records and who could be harmed.</w:t>
+            </w:r>
+          </w:p>
+        </w:tc>
+      </w:tr>
+    </w:tbl>
+    <w:p>
+      <w:pPr>
+        <w:spacing w:before="0" w:after="80"/>
+      </w:pPr>
+    </w:p>
     <w:tbl>
       <w:tblPr>
         <w:tblW w:w="9598" w:type="dxa"/>
@@ -6936,7 +8862,7 @@
             </w:pPr>
             <w:r>
               <w:rPr/>
-              <w:t>Brewline, Zara, Edgar, Kim and Ruth are made up for this example; the 3D machine is a generic model. The bets are a reading of the example, not a rule for every company.</w:t>
+              <w:t>Brewline, Zara, Edgar, Kim and Ruth are made up for this example; the 3D machine is a generic model. The bets are a reading of the example, not a rule for every company. The findings in the table of real evidence are real research results, rules and cases; the sources are listed below.</w:t>
             </w:r>
           </w:p>
         </w:tc>
@@ -7125,7 +9051,7 @@
           <w:color w:val="556274"/>
           <w:sz w:val="18"/>
         </w:rPr>
-        <w:t>GOV.UK Service Manual · Slater &amp; Sanchez-Vives 2016</w:t>
+        <w:t>GOV.UK Service Manual · Slater &amp; Sanchez-Vives 2016 · Kaplan et al. 2021 · Rebenitsch &amp; Owen 2016 · Miller et al. 2020</w:t>
       </w:r>
     </w:p>
     <w:p>
@@ -7618,6 +9544,266 @@
         <w:spacing w:before="0" w:after="80"/>
       </w:pPr>
     </w:p>
+    <w:p>
+      <w:pPr>
+        <w:spacing w:before="0" w:after="100"/>
+      </w:pPr>
+      <w:r>
+        <w:rPr>
+          <w:b/>
+        </w:rPr>
+        <w:t>Who decides on future technologies: real practice</w:t>
+      </w:r>
+    </w:p>
+    <w:tbl>
+      <w:tblPr>
+        <w:tblW w:w="9638" w:type="dxa"/>
+        <w:tblBorders>
+          <w:top w:val="single" w:sz="4" w:space="0" w:color="D5DEE9"/>
+          <w:left w:val="single" w:sz="4" w:space="0" w:color="D5DEE9"/>
+          <w:bottom w:val="single" w:sz="4" w:space="0" w:color="D5DEE9"/>
+          <w:right w:val="single" w:sz="4" w:space="0" w:color="D5DEE9"/>
+          <w:insideH w:val="single" w:sz="4" w:space="0" w:color="D5DEE9"/>
+          <w:insideV w:val="single" w:sz="4" w:space="0" w:color="D5DEE9"/>
+        </w:tblBorders>
+        <w:tblLayout w:type="fixed"/>
+        <w:tblCellMar>
+          <w:top w:w="60" w:type="dxa"/>
+          <w:left w:w="100" w:type="dxa"/>
+          <w:bottom w:w="60" w:type="dxa"/>
+          <w:right w:w="100" w:type="dxa"/>
+        </w:tblCellMar>
+      </w:tblPr>
+      <w:tblGrid>
+        <w:gridCol w:w="1240"/>
+        <w:gridCol w:w="4599"/>
+        <w:gridCol w:w="3799"/>
+      </w:tblGrid>
+      <w:tr>
+        <w:trPr>
+          <w:cantSplit/>
+          <w:tblHeader/>
+        </w:trPr>
+        <w:tc>
+          <w:tcPr>
+            <w:tcW w:type="dxa" w:w="1240"/>
+            <w:shd w:val="clear" w:color="auto" w:fill="E6ECF4"/>
+          </w:tcPr>
+          <w:p>
+            <w:pPr>
+              <w:spacing w:before="0" w:after="0"/>
+            </w:pPr>
+            <w:r>
+              <w:rPr>
+                <w:b/>
+                <w:sz w:val="20"/>
+              </w:rPr>
+              <w:t>Part</w:t>
+            </w:r>
+          </w:p>
+        </w:tc>
+        <w:tc>
+          <w:tcPr>
+            <w:tcW w:type="dxa" w:w="4599"/>
+            <w:shd w:val="clear" w:color="auto" w:fill="E6ECF4"/>
+          </w:tcPr>
+          <w:p>
+            <w:pPr>
+              <w:spacing w:before="0" w:after="0"/>
+            </w:pPr>
+            <w:r>
+              <w:rPr>
+                <w:b/>
+                <w:sz w:val="20"/>
+              </w:rPr>
+              <w:t>Real example</w:t>
+            </w:r>
+          </w:p>
+        </w:tc>
+        <w:tc>
+          <w:tcPr>
+            <w:tcW w:type="dxa" w:w="3799"/>
+            <w:shd w:val="clear" w:color="auto" w:fill="E6ECF4"/>
+          </w:tcPr>
+          <w:p>
+            <w:pPr>
+              <w:spacing w:before="0" w:after="0"/>
+            </w:pPr>
+            <w:r>
+              <w:rPr>
+                <w:b/>
+                <w:sz w:val="20"/>
+              </w:rPr>
+              <w:t>What it means</w:t>
+            </w:r>
+          </w:p>
+        </w:tc>
+      </w:tr>
+      <w:tr>
+        <w:trPr>
+          <w:cantSplit/>
+        </w:trPr>
+        <w:tc>
+          <w:tcPr>
+            <w:tcW w:type="dxa" w:w="1240"/>
+          </w:tcPr>
+          <w:p>
+            <w:pPr>
+              <w:spacing w:before="0" w:after="0"/>
+            </w:pPr>
+            <w:r>
+              <w:rPr>
+                <w:sz w:val="20"/>
+              </w:rPr>
+              <w:t>Gates</w:t>
+            </w:r>
+          </w:p>
+        </w:tc>
+        <w:tc>
+          <w:tcPr>
+            <w:tcW w:type="dxa" w:w="4599"/>
+          </w:tcPr>
+          <w:p>
+            <w:pPr>
+              <w:spacing w:before="0" w:after="0"/>
+            </w:pPr>
+            <w:r>
+              <w:rPr>
+                <w:sz w:val="20"/>
+              </w:rPr>
+              <w:t>Each phase of a UK government service ends with an assessment against the Service Standard (GOV.UK Service Standard).</w:t>
+            </w:r>
+          </w:p>
+        </w:tc>
+        <w:tc>
+          <w:tcPr>
+            <w:tcW w:type="dxa" w:w="3799"/>
+          </w:tcPr>
+          <w:p>
+            <w:pPr>
+              <w:spacing w:before="0" w:after="0"/>
+            </w:pPr>
+            <w:r>
+              <w:rPr>
+                <w:sz w:val="20"/>
+              </w:rPr>
+              <w:t>Write the gate for each pilot: use, completion, support, cost, by a date.</w:t>
+            </w:r>
+          </w:p>
+        </w:tc>
+      </w:tr>
+      <w:tr>
+        <w:trPr>
+          <w:cantSplit/>
+        </w:trPr>
+        <w:tc>
+          <w:tcPr>
+            <w:tcW w:type="dxa" w:w="1240"/>
+          </w:tcPr>
+          <w:p>
+            <w:pPr>
+              <w:spacing w:before="0" w:after="0"/>
+            </w:pPr>
+            <w:r>
+              <w:rPr>
+                <w:sz w:val="20"/>
+              </w:rPr>
+              <w:t>The stop right</w:t>
+            </w:r>
+          </w:p>
+        </w:tc>
+        <w:tc>
+          <w:tcPr>
+            <w:tcW w:type="dxa" w:w="4599"/>
+          </w:tcPr>
+          <w:p>
+            <w:pPr>
+              <w:spacing w:before="0" w:after="0"/>
+            </w:pPr>
+            <w:r>
+              <w:rPr>
+                <w:sz w:val="20"/>
+              </w:rPr>
+              <w:t>The guidance says to decide on evidence, including to stop (GOV.UK Service Manual).</w:t>
+            </w:r>
+          </w:p>
+        </w:tc>
+        <w:tc>
+          <w:tcPr>
+            <w:tcW w:type="dxa" w:w="3799"/>
+          </w:tcPr>
+          <w:p>
+            <w:pPr>
+              <w:spacing w:before="0" w:after="0"/>
+            </w:pPr>
+            <w:r>
+              <w:rPr>
+                <w:sz w:val="20"/>
+              </w:rPr>
+              <w:t>Name who may stop a pilot, and give product safety a stop at any time.</w:t>
+            </w:r>
+          </w:p>
+        </w:tc>
+      </w:tr>
+      <w:tr>
+        <w:trPr>
+          <w:cantSplit/>
+        </w:trPr>
+        <w:tc>
+          <w:tcPr>
+            <w:tcW w:type="dxa" w:w="1240"/>
+          </w:tcPr>
+          <w:p>
+            <w:pPr>
+              <w:spacing w:before="0" w:after="0"/>
+            </w:pPr>
+            <w:r>
+              <w:rPr>
+                <w:sz w:val="20"/>
+              </w:rPr>
+              <w:t>The record</w:t>
+            </w:r>
+          </w:p>
+        </w:tc>
+        <w:tc>
+          <w:tcPr>
+            <w:tcW w:type="dxa" w:w="4599"/>
+          </w:tcPr>
+          <w:p>
+            <w:pPr>
+              <w:spacing w:before="0" w:after="0"/>
+            </w:pPr>
+            <w:r>
+              <w:rPr>
+                <w:sz w:val="20"/>
+              </w:rPr>
+              <w:t>Motion data is identifying (Miller et al. 2020, as reported).</w:t>
+            </w:r>
+          </w:p>
+        </w:tc>
+        <w:tc>
+          <w:tcPr>
+            <w:tcW w:type="dxa" w:w="3799"/>
+          </w:tcPr>
+          <w:p>
+            <w:pPr>
+              <w:spacing w:before="0" w:after="0"/>
+            </w:pPr>
+            <w:r>
+              <w:rPr>
+                <w:sz w:val="20"/>
+              </w:rPr>
+              <w:t>Record what each pilot collects, and who can see it.</w:t>
+            </w:r>
+          </w:p>
+        </w:tc>
+      </w:tr>
+    </w:tbl>
+    <w:p>
+      <w:pPr>
+        <w:spacing w:before="0" w:after="80"/>
+      </w:pPr>
+    </w:p>
     <w:tbl>
       <w:tblPr>
         <w:tblW w:w="9598" w:type="dxa"/>
@@ -7667,7 +9853,7 @@
             </w:pPr>
             <w:r>
               <w:rPr/>
-              <w:t>Brewline, Zara, Edgar, Kim and Ruth are made up for this example; the 3D machine is a generic model. “It's not a failure to stop” follows the GOV.UK Service Manual; deciding with limited information follows Simon (1956); the premortem follows Klein (2007).</w:t>
+              <w:t>Brewline, Zara, Edgar, Kim and Ruth are made up for this example; the 3D machine is a generic model. “It's not a failure to stop” follows the GOV.UK Service Manual; deciding with limited information follows Simon (1956); the premortem follows Klein (2007). The findings in the table of real evidence are real research results, rules and cases; the sources are listed below.</w:t>
             </w:r>
           </w:p>
         </w:tc>
@@ -7856,7 +10042,7 @@
           <w:color w:val="556274"/>
           <w:sz w:val="18"/>
         </w:rPr>
-        <w:t>GOV.UK Service Manual · Simon 1956 · Klein 2007</w:t>
+        <w:t>GOV.UK Service Manual · Simon 1956 · Klein 2007 · GOV.UK Service Standard · Miller et al. 2020</w:t>
       </w:r>
     </w:p>
     <w:p>
@@ -8529,6 +10715,18 @@
         <w:rPr>
           <w:sz w:val="19"/>
         </w:rPr>
+        <w:t>Apple Inc. Human Interface Guidelines: Immersive experiences. https://developer.apple.com/design/human-interface-guidelines/immersive-experiences (read 29.10.2026). (Reserve immersion for meaningful moments; comfort; let people choose when to enter and exit.)</w:t>
+      </w:r>
+    </w:p>
+    <w:p>
+      <w:pPr>
+        <w:spacing w:before="0" w:after="80"/>
+        <w:ind w:left="283" w:hanging="283"/>
+      </w:pPr>
+      <w:r>
+        <w:rPr>
+          <w:sz w:val="19"/>
+        </w:rPr>
         <w:t>Lavie, N. (2005). Distracted and confused?: Selective attention under load. Trends in Cognitive Sciences, 9(2), 75–82. (Attention is limited; under load, what is processed depends on what competes for it.)</w:t>
       </w:r>
     </w:p>
@@ -8553,6 +10751,18 @@
         <w:rPr>
           <w:sz w:val="19"/>
         </w:rPr>
+        <w:t>Kaplan, A. D., Cruit, J., Endsley, M., Beers, S. M., Sawyer, B. D., &amp; Hancock, P. A. (2021). The effects of virtual reality, augmented reality, and mixed reality as training enhancement methods: A meta-analysis. Human Factors, 63(4), 706–726. https://doi.org/10.1177/0018720820904229 (Training in virtual, augmented or mixed reality was about as effective as training in a non-simulated environment, not more.)</w:t>
+      </w:r>
+    </w:p>
+    <w:p>
+      <w:pPr>
+        <w:spacing w:before="0" w:after="80"/>
+        <w:ind w:left="283" w:hanging="283"/>
+      </w:pPr>
+      <w:r>
+        <w:rPr>
+          <w:sz w:val="19"/>
+        </w:rPr>
         <w:t>Government Digital Service. Service Manual: How the discovery phase works; How the alpha phase works. https://www.gov.uk/service-manual/agile-delivery (read 29.10.2026). (Define the problem, test the riskiest assumptions with throwaway prototypes, decide with evidence, including to stop.)</w:t>
       </w:r>
     </w:p>
@@ -8565,7 +10775,7 @@
         <w:rPr>
           <w:sz w:val="19"/>
         </w:rPr>
-        <w:t>Apple Inc. Human Interface Guidelines: Immersive experiences. https://developer.apple.com/design/human-interface-guidelines/immersive-experiences (read 29.10.2026). (Reserve immersion for meaningful moments; comfort; let people choose when to enter and exit.)</w:t>
+        <w:t>GOV.UK Service Manual. Service Standard. https://www.gov.uk/service-manual/service-standard (14 points since July 2019, 18 before; point 1 is to understand users and their needs; services are assessed against the standard.)</w:t>
       </w:r>
     </w:p>
     <w:p>
@@ -8578,6 +10788,18 @@
           <w:sz w:val="19"/>
         </w:rPr>
         <w:t>Gibbons, S. (2018). Using Prioritization Matrices to Inform UX Decisions. Nielsen Norman Group. https://www.nngroup.com/articles/prioritization-matrices/ (Rate each option on the same few criteria, such as value to the user against effort, and put the reason next to each rating.)</w:t>
+      </w:r>
+    </w:p>
+    <w:p>
+      <w:pPr>
+        <w:spacing w:before="0" w:after="80"/>
+        <w:ind w:left="283" w:hanging="283"/>
+      </w:pPr>
+      <w:r>
+        <w:rPr>
+          <w:sz w:val="19"/>
+        </w:rPr>
+        <w:t>Miller, M. R., Herrera, F., Jun, H., Landay, J. A., &amp; Bailenson, J. N. (2020). Personal identifiability of user tracking data during observation of 360-degree VR video. Scientific Reports, 10, 17404. https://doi.org/10.1038/s41598-020-74486-y (More than 500 participants could be identified with above 95% accuracy from less than five minutes of tracking data; figures from summaries.)</w:t>
       </w:r>
     </w:p>
     <w:p>

</xml_diff>